<commit_message>
feat: revise Lesson 9 materials to focus on a four-part paragraph structure, update handouts and presentation, and enhance lesson plan details
</commit_message>
<xml_diff>
--- a/Units/English/English_Unit_3/Lesson_Plans/Lesson_9/Lesson_9_Lucas_Handout.docx
+++ b/Units/English/English_Unit_3/Lesson_Plans/Lesson_9/Lesson_9_Lucas_Handout.docx
@@ -31,7 +31,7 @@
           <w:sz w:val="40"/>
           <w:szCs w:val="40"/>
         </w:rPr>
-        <w:t xml:space="preserve">The Memory Rooms</w:t>
+        <w:t xml:space="preserve">One Paragraph, Four Parts</w:t>
       </w:r>
     </w:p>
     <w:p>
@@ -47,7 +47,7 @@
           <w:sz w:val="23"/>
           <w:szCs w:val="23"/>
         </w:rPr>
-        <w:t xml:space="preserve">A visual paragraph pathway</w:t>
+        <w:t xml:space="preserve">A visual four-part pathway</w:t>
       </w:r>
     </w:p>
     <w:tbl>
@@ -146,7 +146,7 @@
                 <w:bCs/>
                 <w:color w:val="243B53"/>
               </w:rPr>
-              <w:t xml:space="preserve">ORGANISE</w:t>
+              <w:t xml:space="preserve">LABEL</w:t>
             </w:r>
           </w:p>
           <w:p>
@@ -158,7 +158,7 @@
               <w:rPr>
                 <w:rFonts w:ascii="Arial" w:cs="Arial" w:eastAsia="Arial" w:hAnsi="Arial"/>
               </w:rPr>
-              <w:t xml:space="preserve">one focus per room</w:t>
+              <w:t xml:space="preserve">topic + 2 details + close</w:t>
             </w:r>
           </w:p>
         </w:tc>
@@ -204,7 +204,7 @@
               <w:rPr>
                 <w:rFonts w:ascii="Arial" w:cs="Arial" w:eastAsia="Arial" w:hAnsi="Arial"/>
               </w:rPr>
-              <w:t xml:space="preserve">topic + details + meaning</w:t>
+              <w:t xml:space="preserve">choose a prompt</w:t>
             </w:r>
           </w:p>
         </w:tc>
@@ -331,7 +331,7 @@
         <w:rPr>
           <w:rFonts w:ascii="Arial" w:cs="Arial" w:eastAsia="Arial" w:hAnsi="Arial"/>
         </w:rPr>
-        <w:t xml:space="preserve">Circle the details that stay with the topic sentence.</w:t>
+        <w:t xml:space="preserve">Circle the details that stay with the topic sentence. Cross out the intruder.</w:t>
       </w:r>
     </w:p>
     <w:tbl>
@@ -568,7 +568,7 @@
                 <w:sz w:val="24"/>
                 <w:szCs w:val="24"/>
               </w:rPr>
-              <w:t xml:space="preserve">Oma wears large sunglasses.</w:t>
+              <w:t xml:space="preserve">Oma wears designer sunglasses and a silk headscarf.</w:t>
             </w:r>
           </w:p>
         </w:tc>
@@ -596,7 +596,7 @@
           <w:sz w:val="22"/>
           <w:szCs w:val="22"/>
         </w:rPr>
-        <w:t xml:space="preserve">Build three sentences</w:t>
+        <w:t xml:space="preserve">Build four short parts</w:t>
       </w:r>
     </w:p>
     <w:p>
@@ -606,8 +606,10 @@
       <w:r>
         <w:rPr>
           <w:rFonts w:ascii="Arial" w:cs="Arial" w:eastAsia="Arial" w:hAnsi="Arial"/>
-        </w:rPr>
-        <w:t xml:space="preserve">Malia is sad for Papa. She remembers ________________________________________________.</w:t>
+          <w:sz w:val="24"/>
+          <w:szCs w:val="24"/>
+        </w:rPr>
+        <w:t xml:space="preserve">1 Topic: Malia is sad for Papa.</w:t>
       </w:r>
     </w:p>
     <w:p>
@@ -617,8 +619,36 @@
       <w:r>
         <w:rPr>
           <w:rFonts w:ascii="Arial" w:cs="Arial" w:eastAsia="Arial" w:hAnsi="Arial"/>
-        </w:rPr>
-        <w:t xml:space="preserve">This makes her feel ________________________________________________________________.</w:t>
+          <w:sz w:val="24"/>
+          <w:szCs w:val="24"/>
+        </w:rPr>
+        <w:t xml:space="preserve">2 Detail 1: She ________________________________________________________________________</w:t>
+      </w:r>
+    </w:p>
+    <w:p>
+      <w:pPr>
+        <w:spacing w:after="120" w:line="300" w:lineRule="auto"/>
+      </w:pPr>
+      <w:r>
+        <w:rPr>
+          <w:rFonts w:ascii="Arial" w:cs="Arial" w:eastAsia="Arial" w:hAnsi="Arial"/>
+          <w:sz w:val="24"/>
+          <w:szCs w:val="24"/>
+        </w:rPr>
+        <w:t xml:space="preserve">3 Detail 2: She also ____________________________________________________________________</w:t>
+      </w:r>
+    </w:p>
+    <w:p>
+      <w:pPr>
+        <w:spacing w:after="120" w:line="300" w:lineRule="auto"/>
+      </w:pPr>
+      <w:r>
+        <w:rPr>
+          <w:rFonts w:ascii="Arial" w:cs="Arial" w:eastAsia="Arial" w:hAnsi="Arial"/>
+          <w:sz w:val="24"/>
+          <w:szCs w:val="24"/>
+        </w:rPr>
+        <w:t xml:space="preserve">4 Close: This makes her feel ____________________________________________________________</w:t>
       </w:r>
     </w:p>
     <w:p>
@@ -665,247 +695,61 @@
           <w:sz w:val="22"/>
           <w:szCs w:val="22"/>
         </w:rPr>
-        <w:t xml:space="preserve">Make your own paragraph</w:t>
+        <w:t xml:space="preserve">Choose a prompt</w:t>
       </w:r>
     </w:p>
     <w:p>
       <w:pPr>
         <w:spacing w:after="120" w:line="300" w:lineRule="auto"/>
+      </w:pPr>
+      <w:r>
+        <w:rPr>
+          <w:rFonts w:ascii="Arial" w:cs="Arial" w:eastAsia="Arial" w:hAnsi="Arial"/>
+          <w:sz w:val="24"/>
+          <w:szCs w:val="24"/>
+        </w:rPr>
+        <w:t xml:space="preserve">1. A place with feeling</w:t>
+      </w:r>
+    </w:p>
+    <w:p>
+      <w:pPr>
+        <w:spacing w:after="120" w:line="300" w:lineRule="auto"/>
+      </w:pPr>
+      <w:r>
+        <w:rPr>
+          <w:rFonts w:ascii="Arial" w:cs="Arial" w:eastAsia="Arial" w:hAnsi="Arial"/>
+          <w:sz w:val="24"/>
+          <w:szCs w:val="24"/>
+        </w:rPr>
+        <w:t xml:space="preserve">2. Someone who stands out</w:t>
+      </w:r>
+    </w:p>
+    <w:p>
+      <w:pPr>
+        <w:spacing w:after="120" w:line="300" w:lineRule="auto"/>
+      </w:pPr>
+      <w:r>
+        <w:rPr>
+          <w:rFonts w:ascii="Arial" w:cs="Arial" w:eastAsia="Arial" w:hAnsi="Arial"/>
+          <w:sz w:val="24"/>
+          <w:szCs w:val="24"/>
+        </w:rPr>
+        <w:t xml:space="preserve">3. A plan that changed</w:t>
+      </w:r>
+    </w:p>
+    <w:p>
+      <w:pPr>
+        <w:spacing w:before="120"/>
       </w:pPr>
       <w:r>
         <w:rPr>
           <w:rFonts w:ascii="Arial" w:cs="Arial" w:eastAsia="Arial" w:hAnsi="Arial"/>
           <w:b/>
           <w:bCs/>
-          <w:color w:val="3D6B8E"/>
           <w:sz w:val="24"/>
           <w:szCs w:val="24"/>
         </w:rPr>
-        <w:t xml:space="preserve">Choose a real memory, change it, or invent one.</w:t>
-      </w:r>
-    </w:p>
-    <w:tbl>
-      <w:tblPr>
-        <w:tblW w:type="dxa" w:w="9360"/>
-        <w:tblInd w:type="dxa" w:w="120"/>
-        <w:tblBorders>
-          <w:top w:val="single" w:color="auto" w:sz="4"/>
-          <w:left w:val="single" w:color="auto" w:sz="4"/>
-          <w:bottom w:val="single" w:color="auto" w:sz="4"/>
-          <w:right w:val="single" w:color="auto" w:sz="4"/>
-          <w:insideH w:val="single" w:color="auto" w:sz="4"/>
-          <w:insideV w:val="single" w:color="auto" w:sz="4"/>
-        </w:tblBorders>
-        <w:tblLayout w:type="fixed"/>
-      </w:tblPr>
-      <w:tblGrid>
-        <w:gridCol w:w="3120"/>
-        <w:gridCol w:w="3120"/>
-        <w:gridCol w:w="3120"/>
-      </w:tblGrid>
-      <w:tr>
-        <w:tc>
-          <w:tcPr>
-            <w:tcW w:type="dxa" w:w="3120"/>
-            <w:tcBorders>
-              <w:top w:val="single" w:color="BAC8C5" w:sz="6"/>
-              <w:left w:val="single" w:color="BAC8C5" w:sz="6"/>
-              <w:bottom w:val="single" w:color="BAC8C5" w:sz="6"/>
-              <w:right w:val="single" w:color="BAC8C5" w:sz="6"/>
-            </w:tcBorders>
-            <w:shd w:fill="E7E4F3" w:val="clear"/>
-            <w:tcMar>
-              <w:top w:type="dxa" w:w="100"/>
-              <w:left w:type="dxa" w:w="140"/>
-              <w:bottom w:type="dxa" w:w="100"/>
-              <w:right w:type="dxa" w:w="140"/>
-            </w:tcMar>
-            <w:vAlign w:val="center"/>
-          </w:tcPr>
-          <w:p>
-            <w:pPr>
-              <w:spacing w:after="40"/>
-              <w:jc w:val="center"/>
-            </w:pPr>
-            <w:r>
-              <w:rPr>
-                <w:rFonts w:ascii="Arial" w:cs="Arial" w:eastAsia="Arial" w:hAnsi="Arial"/>
-                <w:b/>
-                <w:bCs/>
-                <w:color w:val="243B53"/>
-                <w:sz w:val="25"/>
-                <w:szCs w:val="25"/>
-              </w:rPr>
-              <w:t xml:space="preserve">1  FOCUS</w:t>
-            </w:r>
-          </w:p>
-          <w:p>
-            <w:pPr>
-              <w:spacing w:after="0"/>
-              <w:jc w:val="center"/>
-            </w:pPr>
-            <w:r>
-              <w:rPr>
-                <w:rFonts w:ascii="Arial" w:cs="Arial" w:eastAsia="Arial" w:hAnsi="Arial"/>
-                <w:sz w:val="22"/>
-                <w:szCs w:val="22"/>
-              </w:rPr>
-              <w:t xml:space="preserve">This paragraph is about ...</w:t>
-            </w:r>
-          </w:p>
-        </w:tc>
-        <w:tc>
-          <w:tcPr>
-            <w:tcW w:type="dxa" w:w="3120"/>
-            <w:tcBorders>
-              <w:top w:val="single" w:color="BAC8C5" w:sz="6"/>
-              <w:left w:val="single" w:color="BAC8C5" w:sz="6"/>
-              <w:bottom w:val="single" w:color="BAC8C5" w:sz="6"/>
-              <w:right w:val="single" w:color="BAC8C5" w:sz="6"/>
-            </w:tcBorders>
-            <w:shd w:fill="DDEBE3" w:val="clear"/>
-            <w:tcMar>
-              <w:top w:type="dxa" w:w="100"/>
-              <w:left w:type="dxa" w:w="140"/>
-              <w:bottom w:type="dxa" w:w="100"/>
-              <w:right w:type="dxa" w:w="140"/>
-            </w:tcMar>
-            <w:vAlign w:val="center"/>
-          </w:tcPr>
-          <w:p>
-            <w:pPr>
-              <w:spacing w:after="40"/>
-              <w:jc w:val="center"/>
-            </w:pPr>
-            <w:r>
-              <w:rPr>
-                <w:rFonts w:ascii="Arial" w:cs="Arial" w:eastAsia="Arial" w:hAnsi="Arial"/>
-                <w:b/>
-                <w:bCs/>
-                <w:color w:val="243B53"/>
-                <w:sz w:val="25"/>
-                <w:szCs w:val="25"/>
-              </w:rPr>
-              <w:t xml:space="preserve">2  DETAILS</w:t>
-            </w:r>
-          </w:p>
-          <w:p>
-            <w:pPr>
-              <w:spacing w:after="0"/>
-              <w:jc w:val="center"/>
-            </w:pPr>
-            <w:r>
-              <w:rPr>
-                <w:rFonts w:ascii="Arial" w:cs="Arial" w:eastAsia="Arial" w:hAnsi="Arial"/>
-                <w:sz w:val="22"/>
-                <w:szCs w:val="22"/>
-              </w:rPr>
-              <w:t xml:space="preserve">Two things that belong</w:t>
-            </w:r>
-          </w:p>
-        </w:tc>
-        <w:tc>
-          <w:tcPr>
-            <w:tcW w:type="dxa" w:w="3120"/>
-            <w:tcBorders>
-              <w:top w:val="single" w:color="BAC8C5" w:sz="6"/>
-              <w:left w:val="single" w:color="BAC8C5" w:sz="6"/>
-              <w:bottom w:val="single" w:color="BAC8C5" w:sz="6"/>
-              <w:right w:val="single" w:color="BAC8C5" w:sz="6"/>
-            </w:tcBorders>
-            <w:shd w:fill="FFF9EC" w:val="clear"/>
-            <w:tcMar>
-              <w:top w:type="dxa" w:w="100"/>
-              <w:left w:type="dxa" w:w="140"/>
-              <w:bottom w:type="dxa" w:w="100"/>
-              <w:right w:type="dxa" w:w="140"/>
-            </w:tcMar>
-            <w:vAlign w:val="center"/>
-          </w:tcPr>
-          <w:p>
-            <w:pPr>
-              <w:spacing w:after="40"/>
-              <w:jc w:val="center"/>
-            </w:pPr>
-            <w:r>
-              <w:rPr>
-                <w:rFonts w:ascii="Arial" w:cs="Arial" w:eastAsia="Arial" w:hAnsi="Arial"/>
-                <w:b/>
-                <w:bCs/>
-                <w:color w:val="243B53"/>
-                <w:sz w:val="25"/>
-                <w:szCs w:val="25"/>
-              </w:rPr>
-              <w:t xml:space="preserve">3  FEELING</w:t>
-            </w:r>
-          </w:p>
-          <w:p>
-            <w:pPr>
-              <w:spacing w:after="0"/>
-              <w:jc w:val="center"/>
-            </w:pPr>
-            <w:r>
-              <w:rPr>
-                <w:rFonts w:ascii="Arial" w:cs="Arial" w:eastAsia="Arial" w:hAnsi="Arial"/>
-                <w:sz w:val="22"/>
-                <w:szCs w:val="22"/>
-              </w:rPr>
-              <w:t xml:space="preserve">How the memory matters</w:t>
-            </w:r>
-          </w:p>
-        </w:tc>
-      </w:tr>
-    </w:tbl>
-    <w:p>
-      <w:pPr>
-        <w:spacing w:after="120" w:line="300" w:lineRule="auto"/>
-      </w:pPr>
-      <w:r>
-        <w:rPr>
-          <w:rFonts w:ascii="Arial" w:cs="Arial" w:eastAsia="Arial" w:hAnsi="Arial"/>
-          <w:sz w:val="24"/>
-          <w:szCs w:val="24"/>
-        </w:rPr>
-        <w:t xml:space="preserve">Topic sentence: ______________________________________________________________________</w:t>
-      </w:r>
-    </w:p>
-    <w:p>
-      <w:pPr>
-        <w:spacing w:after="120" w:line="300" w:lineRule="auto"/>
-      </w:pPr>
-      <w:r>
-        <w:rPr>
-          <w:rFonts w:ascii="Arial" w:cs="Arial" w:eastAsia="Arial" w:hAnsi="Arial"/>
-          <w:sz w:val="24"/>
-          <w:szCs w:val="24"/>
-        </w:rPr>
-        <w:t xml:space="preserve">Detail 1: ____________________________________________________________________________</w:t>
-      </w:r>
-    </w:p>
-    <w:p>
-      <w:pPr>
-        <w:spacing w:after="120" w:line="300" w:lineRule="auto"/>
-      </w:pPr>
-      <w:r>
-        <w:rPr>
-          <w:rFonts w:ascii="Arial" w:cs="Arial" w:eastAsia="Arial" w:hAnsi="Arial"/>
-          <w:sz w:val="24"/>
-          <w:szCs w:val="24"/>
-        </w:rPr>
-        <w:t xml:space="preserve">Detail 2: ____________________________________________________________________________</w:t>
-      </w:r>
-    </w:p>
-    <w:p>
-      <w:pPr>
-        <w:spacing w:after="120" w:line="300" w:lineRule="auto"/>
-      </w:pPr>
-      <w:r>
-        <w:rPr>
-          <w:rFonts w:ascii="Arial" w:cs="Arial" w:eastAsia="Arial" w:hAnsi="Arial"/>
-          <w:sz w:val="24"/>
-          <w:szCs w:val="24"/>
-        </w:rPr>
-        <w:t xml:space="preserve">Closing feeling: _____________________________________________________________________</w:t>
+        <w:t xml:space="preserve">My prompt number: ______</w:t>
       </w:r>
     </w:p>
     <w:p>

</xml_diff>